<commit_message>
realice modificaciones al informe
</commit_message>
<xml_diff>
--- a/documentos/Informe ejecutivo.docx
+++ b/documentos/Informe ejecutivo.docx
@@ -19,7 +19,7 @@
           <w:bCs/>
           <w:u w:val="single"/>
         </w:rPr>
-        <w:t xml:space="preserve">Resumen ejecutivo </w:t>
+        <w:t>Resumen ejecutivo</w:t>
       </w:r>
     </w:p>
     <w:p>
@@ -67,10 +67,7 @@
       </w:r>
       <w:proofErr w:type="spellEnd"/>
       <w:r>
-        <w:t>, registro y recuperac</w:t>
-      </w:r>
-      <w:r>
-        <w:t>ión de contraseña.</w:t>
+        <w:t>, registro y recuperación de contraseña.</w:t>
       </w:r>
     </w:p>
     <w:p>
@@ -196,10 +193,7 @@
       </w:r>
       <w:proofErr w:type="spellEnd"/>
       <w:r>
-        <w:t xml:space="preserve"> es una aplicación bastante estable en su desarrollo, sin embargo se encontraron puntos de mejora en cuanto a los gustos y recomendaciones, pues esta es la columna vertebral de la misma, pues esta ofrece un </w:t>
-      </w:r>
-      <w:r>
-        <w:t xml:space="preserve">asesor personal inteligente, donde el usuario no tiene que pensar qué escuchar ya la </w:t>
+        <w:t xml:space="preserve"> es una aplicación bastante estable en su desarrollo, sin embargo se encontraron puntos de mejora en cuanto a los gustos y recomendaciones, pues esta es la columna vertebral de la misma, pues esta ofrece un asesor personal inteligente, donde el usuario no tiene que pensar qué escuchar ya la </w:t>
       </w:r>
       <w:proofErr w:type="spellStart"/>
       <w:r>
@@ -221,14 +215,7 @@
           <w:b/>
           <w:bCs/>
         </w:rPr>
-        <w:t>Defe</w:t>
-      </w:r>
-      <w:r>
-        <w:rPr>
-          <w:b/>
-          <w:bCs/>
-        </w:rPr>
-        <w:t xml:space="preserve">ctos críticos: </w:t>
+        <w:t xml:space="preserve">Defectos críticos: </w:t>
       </w:r>
       <w:r>
         <w:t xml:space="preserve">Entre los defectos críticos se identificaron 2 </w:t>
@@ -282,10 +269,7 @@
         <w:t xml:space="preserve">Conclusiones: </w:t>
       </w:r>
       <w:r>
-        <w:t>La aplicación presenta un alto nivel de es</w:t>
-      </w:r>
-      <w:r>
-        <w:t>tabilidad en sus funciones principales de acceso y reproducción. Sin embargo, la gestión de sugerencias de artistas, listas de reproducción y la transición entre modos de conexión (modo avión, ahorro de datos) presentan inconsistencias menores.</w:t>
+        <w:t>La aplicación presenta un alto nivel de estabilidad en sus funciones principales de acceso y reproducción. Sin embargo, la gestión de sugerencias de artistas, listas de reproducción y la transición entre modos de conexión (modo avión, ahorro de datos) presentan inconsistencias menores.</w:t>
       </w:r>
     </w:p>
     <w:p>
@@ -306,15 +290,7 @@
           <w:bCs/>
           <w:u w:val="single"/>
         </w:rPr>
-        <w:t>Recomendaci</w:t>
-      </w:r>
-      <w:r>
-        <w:rPr>
-          <w:b/>
-          <w:bCs/>
-          <w:u w:val="single"/>
-        </w:rPr>
-        <w:t>ones para el cliente o equipo de desarrollo.</w:t>
+        <w:t>Recomendaciones para el cliente o equipo de desarrollo.</w:t>
       </w:r>
     </w:p>
     <w:p>
@@ -324,10 +300,7 @@
       </w:pPr>
       <w:r>
         <w:tab/>
-        <w:t>Recomendaciones: Se recomienda que el equipo de desarrollo aborde la implementación de la opción “olvidé mi contraseña” para corregir el fallo que se detectó en el CP-03, por el hecho de no existir una opción v</w:t>
-      </w:r>
-      <w:r>
-        <w:t xml:space="preserve">isible para recuperar la clave. Es vital añadir este enlace en la pantalla de </w:t>
+        <w:t xml:space="preserve">Recomendaciones: Se recomienda que el equipo de desarrollo aborde la implementación de la opción “olvidé mi contraseña” para corregir el fallo que se detectó en el CP-03, por el hecho de no existir una opción visible para recuperar la clave. Es vital añadir este enlace en la pantalla de </w:t>
       </w:r>
       <w:proofErr w:type="spellStart"/>
       <w:r>
@@ -360,10 +333,7 @@
       </w:r>
       <w:proofErr w:type="spellEnd"/>
       <w:r>
-        <w:t xml:space="preserve"> filtre con un 100</w:t>
-      </w:r>
-      <w:r>
-        <w:t xml:space="preserve">% de eficacia los artistas ya existentes en la biblioteca del usuario, garantizando que el contenido sea realmente </w:t>
+        <w:t xml:space="preserve"> filtre con un 100% de eficacia los artistas ya existentes en la biblioteca del usuario, garantizando que el contenido sea realmente </w:t>
       </w:r>
       <w:proofErr w:type="spellStart"/>
       <w:r>
@@ -373,12 +343,6 @@
       <w:r>
         <w:t xml:space="preserve"> los casos CP-25 y CP-26, se observó que la lista de "Descubrimiento" repite artistas que ya están en favoritos.</w:t>
       </w:r>
-    </w:p>
-    <w:p>
-      <w:pPr>
-        <w:pStyle w:val="normal1"/>
-        <w:spacing w:before="240" w:after="240"/>
-      </w:pPr>
     </w:p>
     <w:sectPr>
       <w:pgSz w:w="11909" w:h="16834"/>
@@ -1796,7 +1760,7 @@
         <w:rFonts w:ascii="Arial" w:eastAsia="Arial" w:hAnsi="Arial" w:cs="Arial"/>
         <w:sz w:val="22"/>
         <w:szCs w:val="22"/>
-        <w:lang w:eastAsia="es-ES" w:bidi="ar-SA"/>
+        <w:lang w:val="es-ES" w:eastAsia="es-ES" w:bidi="ar-SA"/>
       </w:rPr>
     </w:rPrDefault>
     <w:pPrDefault>
@@ -1947,6 +1911,7 @@
   <w:style w:type="paragraph" w:default="1" w:styleId="Normal">
     <w:name w:val="Normal"/>
     <w:qFormat/>
+    <w:rsid w:val="00254F86"/>
   </w:style>
   <w:style w:type="paragraph" w:styleId="Ttulo1">
     <w:name w:val="heading 1"/>

</xml_diff>

<commit_message>
agregando modificaiones al informe ejecutivo
</commit_message>
<xml_diff>
--- a/documentos/Informe ejecutivo.docx
+++ b/documentos/Informe ejecutivo.docx
@@ -4,23 +4,188 @@
   <w:body>
     <w:p>
       <w:pPr>
+        <w:pStyle w:val="NormalWeb"/>
+        <w:spacing w:before="0" w:beforeAutospacing="0" w:after="0" w:afterAutospacing="0"/>
+      </w:pPr>
+      <w:r>
+        <w:rPr>
+          <w:rFonts w:ascii="Arial" w:hAnsi="Arial" w:cs="Arial"/>
+          <w:b/>
+          <w:bCs/>
+          <w:color w:val="000000"/>
+          <w:sz w:val="36"/>
+          <w:szCs w:val="36"/>
+        </w:rPr>
+        <w:t>INFORME EJECUTIVO</w:t>
+      </w:r>
+    </w:p>
+    <w:p>
+      <w:pPr>
+        <w:pStyle w:val="NormalWeb"/>
+        <w:spacing w:before="0" w:beforeAutospacing="0" w:after="0" w:afterAutospacing="0"/>
+      </w:pPr>
+      <w:r>
+        <w:rPr>
+          <w:rFonts w:ascii="Arial" w:hAnsi="Arial" w:cs="Arial"/>
+          <w:b/>
+          <w:bCs/>
+          <w:color w:val="000000"/>
+          <w:sz w:val="28"/>
+          <w:szCs w:val="28"/>
+        </w:rPr>
+        <w:t xml:space="preserve">Proyecto: Aplicación </w:t>
+      </w:r>
+      <w:proofErr w:type="spellStart"/>
+      <w:r>
+        <w:rPr>
+          <w:rFonts w:ascii="Arial" w:hAnsi="Arial" w:cs="Arial"/>
+          <w:b/>
+          <w:bCs/>
+          <w:color w:val="000000"/>
+          <w:sz w:val="28"/>
+          <w:szCs w:val="28"/>
+        </w:rPr>
+        <w:t>Spotify</w:t>
+      </w:r>
+      <w:proofErr w:type="spellEnd"/>
+    </w:p>
+    <w:p>
+      <w:pPr>
+        <w:pStyle w:val="NormalWeb"/>
+        <w:spacing w:before="0" w:beforeAutospacing="0" w:after="0" w:afterAutospacing="0"/>
+      </w:pPr>
+      <w:r>
+        <w:rPr>
+          <w:rFonts w:ascii="Arial" w:hAnsi="Arial" w:cs="Arial"/>
+          <w:b/>
+          <w:bCs/>
+          <w:color w:val="000000"/>
+          <w:sz w:val="28"/>
+          <w:szCs w:val="28"/>
+        </w:rPr>
+        <w:t xml:space="preserve">Equipo - </w:t>
+      </w:r>
+      <w:proofErr w:type="spellStart"/>
+      <w:r>
+        <w:rPr>
+          <w:rFonts w:ascii="Arial" w:hAnsi="Arial" w:cs="Arial"/>
+          <w:b/>
+          <w:bCs/>
+          <w:color w:val="000000"/>
+          <w:sz w:val="28"/>
+          <w:szCs w:val="28"/>
+        </w:rPr>
+        <w:t>testing</w:t>
+      </w:r>
+      <w:proofErr w:type="spellEnd"/>
+      <w:r>
+        <w:rPr>
+          <w:rFonts w:ascii="Arial" w:hAnsi="Arial" w:cs="Arial"/>
+          <w:b/>
+          <w:bCs/>
+          <w:color w:val="000000"/>
+          <w:sz w:val="28"/>
+          <w:szCs w:val="28"/>
+        </w:rPr>
+        <w:t xml:space="preserve">: </w:t>
+      </w:r>
+      <w:proofErr w:type="spellStart"/>
+      <w:r>
+        <w:rPr>
+          <w:rFonts w:ascii="Arial" w:hAnsi="Arial" w:cs="Arial"/>
+          <w:b/>
+          <w:bCs/>
+          <w:color w:val="000000"/>
+          <w:sz w:val="28"/>
+          <w:szCs w:val="28"/>
+        </w:rPr>
+        <w:t>Maria</w:t>
+      </w:r>
+      <w:proofErr w:type="spellEnd"/>
+      <w:r>
+        <w:rPr>
+          <w:rFonts w:ascii="Arial" w:hAnsi="Arial" w:cs="Arial"/>
+          <w:b/>
+          <w:bCs/>
+          <w:color w:val="000000"/>
+          <w:sz w:val="28"/>
+          <w:szCs w:val="28"/>
+        </w:rPr>
+        <w:t xml:space="preserve"> Isabel </w:t>
+      </w:r>
+      <w:proofErr w:type="spellStart"/>
+      <w:r>
+        <w:rPr>
+          <w:rFonts w:ascii="Arial" w:hAnsi="Arial" w:cs="Arial"/>
+          <w:b/>
+          <w:bCs/>
+          <w:color w:val="000000"/>
+          <w:sz w:val="28"/>
+          <w:szCs w:val="28"/>
+        </w:rPr>
+        <w:t>Morey</w:t>
+      </w:r>
+      <w:proofErr w:type="spellEnd"/>
+    </w:p>
+    <w:p>
+      <w:pPr>
+        <w:pStyle w:val="NormalWeb"/>
+        <w:spacing w:before="0" w:beforeAutospacing="0" w:after="0" w:afterAutospacing="0"/>
+        <w:rPr>
+          <w:rFonts w:ascii="Arial" w:hAnsi="Arial" w:cs="Arial"/>
+          <w:b/>
+          <w:bCs/>
+          <w:color w:val="000000"/>
+          <w:sz w:val="28"/>
+          <w:szCs w:val="28"/>
+        </w:rPr>
+      </w:pPr>
+      <w:r>
+        <w:rPr>
+          <w:rFonts w:ascii="Arial" w:hAnsi="Arial" w:cs="Arial"/>
+          <w:b/>
+          <w:bCs/>
+          <w:color w:val="000000"/>
+          <w:sz w:val="28"/>
+          <w:szCs w:val="28"/>
+        </w:rPr>
+        <w:t>Fecha: 26 de febrero de 2026</w:t>
+      </w:r>
+    </w:p>
+    <w:p>
+      <w:pPr>
+        <w:pStyle w:val="NormalWeb"/>
+        <w:spacing w:before="0" w:beforeAutospacing="0" w:after="0" w:afterAutospacing="0"/>
+      </w:pPr>
+    </w:p>
+    <w:p>
+      <w:pPr>
+        <w:pStyle w:val="NormalWeb"/>
+        <w:spacing w:before="0" w:beforeAutospacing="0" w:after="0" w:afterAutospacing="0"/>
+      </w:pPr>
+      <w:r>
+        <w:rPr>
+          <w:rFonts w:ascii="Arial" w:hAnsi="Arial" w:cs="Arial"/>
+          <w:b/>
+          <w:bCs/>
+          <w:color w:val="000000"/>
+          <w:sz w:val="28"/>
+          <w:szCs w:val="28"/>
+        </w:rPr>
+        <w:t>_________________________________________________________</w:t>
+      </w:r>
+    </w:p>
+    <w:p>
+      <w:pPr>
         <w:pStyle w:val="normal1"/>
         <w:spacing w:before="240" w:after="240"/>
-        <w:jc w:val="center"/>
+        <w:ind w:firstLine="720"/>
+        <w:jc w:val="both"/>
         <w:rPr>
           <w:b/>
           <w:bCs/>
-          <w:u w:val="single"/>
         </w:rPr>
       </w:pPr>
-      <w:r>
-        <w:rPr>
-          <w:b/>
-          <w:bCs/>
-          <w:u w:val="single"/>
-        </w:rPr>
-        <w:t>Resumen ejecutivo</w:t>
-      </w:r>
     </w:p>
     <w:p>
       <w:pPr>
@@ -122,6 +287,7 @@
       <w:pPr>
         <w:pStyle w:val="normal1"/>
         <w:spacing w:before="240" w:after="240"/>
+        <w:jc w:val="both"/>
       </w:pPr>
       <w:r>
         <w:rPr>
@@ -143,9 +309,16 @@
           <w:numId w:val="9"/>
         </w:numPr>
         <w:spacing w:before="240"/>
-      </w:pPr>
-      <w:r>
-        <w:t xml:space="preserve">Dispositivos: Dispositivo móvil (HONOR X8), PC (DELL) </w:t>
+        <w:jc w:val="both"/>
+      </w:pPr>
+      <w:r>
+        <w:t>Dispositivos: Dispositivo móvil (HONOR X8</w:t>
+      </w:r>
+      <w:r>
+        <w:t>, TECNO SPART 10 PRO</w:t>
+      </w:r>
+      <w:r>
+        <w:t xml:space="preserve">), PC (DELL) </w:t>
       </w:r>
     </w:p>
     <w:p>
@@ -156,6 +329,7 @@
           <w:numId w:val="9"/>
         </w:numPr>
         <w:spacing w:after="240"/>
+        <w:jc w:val="both"/>
       </w:pPr>
       <w:r>
         <w:t xml:space="preserve">Red: Conexiones </w:t>
@@ -173,6 +347,7 @@
       <w:pPr>
         <w:pStyle w:val="normal1"/>
         <w:spacing w:before="240" w:after="240"/>
+        <w:jc w:val="both"/>
       </w:pPr>
       <w:r>
         <w:tab/>
@@ -185,23 +360,50 @@
         <w:t>Resultados:</w:t>
       </w:r>
       <w:r>
-        <w:t xml:space="preserve"> Según las pruebas ejecutadas indican que </w:t>
+        <w:t xml:space="preserve"> Según las </w:t>
+      </w:r>
+      <w:r>
+        <w:t xml:space="preserve">pruebas ejecutadas indican que </w:t>
       </w:r>
       <w:proofErr w:type="spellStart"/>
       <w:r>
-        <w:t>spotify</w:t>
+        <w:t>S</w:t>
+      </w:r>
+      <w:r>
+        <w:t>potify</w:t>
       </w:r>
       <w:proofErr w:type="spellEnd"/>
       <w:r>
-        <w:t xml:space="preserve"> es una aplicación bastante estable en su desarrollo, sin embargo se encontraron puntos de mejora en cuanto a los gustos y recomendaciones, pues esta es la columna vertebral de la misma, pues esta ofrece un asesor personal inteligente, donde el usuario no tiene que pensar qué escuchar ya la </w:t>
+        <w:t xml:space="preserve"> es una aplicación ba</w:t>
+      </w:r>
+      <w:r>
+        <w:t xml:space="preserve">stante estable en su desarrollo. Tanto las pruebas de gestión de usuario como de reproducción estas dieron resultados positivamente bueno ya que no se encontraron </w:t>
       </w:r>
       <w:proofErr w:type="spellStart"/>
       <w:r>
-        <w:t>app</w:t>
+        <w:t>busg</w:t>
       </w:r>
       <w:proofErr w:type="spellEnd"/>
       <w:r>
-        <w:t xml:space="preserve"> lo sabe, además este puede recibir recomendaciones que resuenan con su estado de ánimo en tiempo real, ya que se genera un vínculo de fidelidad con la plataforma.</w:t>
+        <w:t xml:space="preserve">, a </w:t>
+      </w:r>
+      <w:r>
+        <w:t>excepción</w:t>
+      </w:r>
+      <w:r>
+        <w:t xml:space="preserve"> del CP-03 que presento una falla al no pasar la prueba de recuperar contraseña, pues esta no cuenta con una opción de la misma. En este orden al realizar las pruebas de búsqueda </w:t>
+      </w:r>
+      <w:r>
+        <w:t>se detectaron fallas como por ejemplo los casos CP-25 Y CP-26 en los cuales se deja ver que hay que mejorar el</w:t>
+      </w:r>
+      <w:r>
+        <w:t xml:space="preserve"> algoritmo para los gustos y recomendaciones, </w:t>
+      </w:r>
+      <w:r>
+        <w:t xml:space="preserve">pues esta es </w:t>
+      </w:r>
+      <w:r>
+        <w:t>la columna vertebral de la aplicación.</w:t>
       </w:r>
     </w:p>
     <w:p>
@@ -209,6 +411,7 @@
         <w:pStyle w:val="normal1"/>
         <w:spacing w:before="240" w:after="240"/>
         <w:ind w:firstLine="720"/>
+        <w:jc w:val="both"/>
       </w:pPr>
       <w:r>
         <w:rPr>
@@ -225,15 +428,14 @@
       <w:pPr>
         <w:pStyle w:val="normal1"/>
         <w:spacing w:before="240" w:after="240"/>
+        <w:jc w:val="both"/>
       </w:pPr>
       <w:r>
         <w:t xml:space="preserve">CP-25: Se repiten dos artistas de los que ya </w:t>
       </w:r>
-      <w:proofErr w:type="spellStart"/>
-      <w:r>
-        <w:t>estan</w:t>
-      </w:r>
-      <w:proofErr w:type="spellEnd"/>
+      <w:r>
+        <w:t>están</w:t>
+      </w:r>
       <w:r>
         <w:t xml:space="preserve"> en favoritos</w:t>
       </w:r>
@@ -242,15 +444,14 @@
       <w:pPr>
         <w:pStyle w:val="normal1"/>
         <w:spacing w:before="240" w:after="240"/>
+        <w:jc w:val="both"/>
       </w:pPr>
       <w:r>
         <w:t xml:space="preserve">CP-26: La lista sugerida contiene 08 artistas y 02 ya </w:t>
       </w:r>
-      <w:proofErr w:type="spellStart"/>
-      <w:r>
-        <w:t>estan</w:t>
-      </w:r>
-      <w:proofErr w:type="spellEnd"/>
+      <w:r>
+        <w:t>están</w:t>
+      </w:r>
       <w:r>
         <w:t xml:space="preserve"> en favoritos</w:t>
       </w:r>
@@ -260,6 +461,7 @@
         <w:pStyle w:val="normal1"/>
         <w:spacing w:before="240" w:after="240"/>
         <w:ind w:firstLine="720"/>
+        <w:jc w:val="both"/>
       </w:pPr>
       <w:r>
         <w:rPr>
@@ -269,7 +471,13 @@
         <w:t xml:space="preserve">Conclusiones: </w:t>
       </w:r>
       <w:r>
-        <w:t>La aplicación presenta un alto nivel de estabilidad en sus funciones principales de acceso y reproducción. Sin embargo, la gestión de sugerencias de artistas, listas de reproducción y la transición entre modos de conexión (modo avión, ahorro de datos) presentan inconsistencias menores.</w:t>
+        <w:t>La aplicación presenta un alto nivel de estabilidad en sus funciones principales de acceso y reproducción. Sin embargo, la gestión de sugerencias de artistas, listas de reproducción y la transición entre modos de conexión (modo avión, ahorro de datos) p</w:t>
+      </w:r>
+      <w:r>
+        <w:t>resentan inconsistencias</w:t>
+      </w:r>
+      <w:r>
+        <w:t>.</w:t>
       </w:r>
     </w:p>
     <w:p>
@@ -277,7 +485,7 @@
         <w:pStyle w:val="normal1"/>
         <w:spacing w:before="240" w:after="240"/>
         <w:ind w:left="720"/>
-        <w:jc w:val="center"/>
+        <w:jc w:val="both"/>
         <w:rPr>
           <w:b/>
           <w:bCs/>
@@ -297,10 +505,15 @@
       <w:pPr>
         <w:pStyle w:val="normal1"/>
         <w:spacing w:before="240" w:after="240"/>
+        <w:jc w:val="both"/>
       </w:pPr>
       <w:r>
         <w:tab/>
-        <w:t xml:space="preserve">Recomendaciones: Se recomienda que el equipo de desarrollo aborde la implementación de la opción “olvidé mi contraseña” para corregir el fallo que se detectó en el CP-03, por el hecho de no existir una opción visible para recuperar la clave. Es vital añadir este enlace en la pantalla de </w:t>
+        <w:t xml:space="preserve">Recomendaciones: Se recomienda que el equipo de desarrollo aborde la implementación de la opción “olvidé mi contraseña” para corregir el fallo que se detectó en </w:t>
+      </w:r>
+      <w:r>
+        <w:lastRenderedPageBreak/>
+        <w:t xml:space="preserve">el CP-03, por el hecho de no existir una opción visible para recuperar la clave. Es vital añadir este enlace en la pantalla de </w:t>
       </w:r>
       <w:proofErr w:type="spellStart"/>
       <w:r>
@@ -315,6 +528,7 @@
       <w:pPr>
         <w:pStyle w:val="normal1"/>
         <w:spacing w:before="240" w:after="240"/>
+        <w:jc w:val="both"/>
       </w:pPr>
       <w:r>
         <w:t xml:space="preserve">En este sentido también se sugiere ajustar el algoritmo de descubrimiento, para que la herramienta de </w:t>
@@ -333,15 +547,7 @@
       </w:r>
       <w:proofErr w:type="spellEnd"/>
       <w:r>
-        <w:t xml:space="preserve"> filtre con un 100% de eficacia los artistas ya existentes en la biblioteca del usuario, garantizando que el contenido sea realmente </w:t>
-      </w:r>
-      <w:proofErr w:type="spellStart"/>
-      <w:r>
-        <w:t>nuevo.En</w:t>
-      </w:r>
-      <w:proofErr w:type="spellEnd"/>
-      <w:r>
-        <w:t xml:space="preserve"> los casos CP-25 y CP-26, se observó que la lista de "Descubrimiento" repite artistas que ya están en favoritos.</w:t>
+        <w:t xml:space="preserve"> filtre con un 100% de eficacia los artistas ya existentes en la biblioteca del usuario, garantizando que el contenido sea realmente nuevo.</w:t>
       </w:r>
     </w:p>
     <w:sectPr>
@@ -2116,6 +2322,22 @@
       </w:tblCellMar>
     </w:tblPr>
   </w:style>
+  <w:style w:type="paragraph" w:styleId="NormalWeb">
+    <w:name w:val="Normal (Web)"/>
+    <w:basedOn w:val="Normal"/>
+    <w:uiPriority w:val="99"/>
+    <w:semiHidden/>
+    <w:unhideWhenUsed/>
+    <w:rsid w:val="0026709C"/>
+    <w:pPr>
+      <w:spacing w:before="100" w:beforeAutospacing="1" w:after="100" w:afterAutospacing="1" w:line="240" w:lineRule="auto"/>
+    </w:pPr>
+    <w:rPr>
+      <w:rFonts w:ascii="Times New Roman" w:eastAsia="Times New Roman" w:hAnsi="Times New Roman" w:cs="Times New Roman"/>
+      <w:sz w:val="24"/>
+      <w:szCs w:val="24"/>
+    </w:rPr>
+  </w:style>
 </w:styles>
 </file>
 

</xml_diff>